<commit_message>
Fill in student name and ID in notebook and report
</commit_message>
<xml_diff>
--- a/PROJECT_REPORT.docx
+++ b/PROJECT_REPORT.docx
@@ -24,7 +24,7 @@
         <w:pStyle w:val="ListBullet"/>
       </w:pPr>
       <w:r>
-        <w:t>이름: [YOUR NAME]</w:t>
+        <w:t>이름: 쿠츠커러프 버부르벡</w:t>
       </w:r>
     </w:p>
     <w:p>
@@ -32,7 +32,7 @@
         <w:pStyle w:val="ListBullet"/>
       </w:pPr>
       <w:r>
-        <w:t>학번: [YOUR STUDENT ID]</w:t>
+        <w:t>학번: 20232765</w:t>
       </w:r>
     </w:p>
     <w:p/>

</xml_diff>